<commit_message>
PyMOLMovies handout: add GitHub download and setup instructions
Co-Authored-By: Claude Opus 5.5 <noreply@anthropic.com>
</commit_message>
<xml_diff>
--- a/PyMOLMovies/PyMOL_Movies_Handout.docx
+++ b/PyMOLMovies/PyMOL_Movies_Handout.docx
@@ -43,7 +43,37 @@
         <w:pStyle w:val="Heading1"/>
       </w:pPr>
       <w:r>
-        <w:t xml:space="preserve">Getting started</w:t>
+        <w:t xml:space="preserve">Get the files</w:t>
+      </w:r>
+    </w:p>
+    <w:p>
+      <w:pPr>
+        <w:spacing w:after="100"/>
+      </w:pPr>
+      <w:r>
+        <w:t xml:space="preserve">Everything is on GitHub: </w:t>
+      </w:r>
+      <w:r>
+        <w:rPr>
+          <w:rFonts w:ascii="Menlo" w:cs="Menlo" w:eastAsia="Menlo" w:hAnsi="Menlo"/>
+          <w:sz w:val="18"/>
+          <w:szCs w:val="18"/>
+        </w:rPr>
+        <w:t xml:space="preserve">github.com/anshuJS/Tutorials_BIOL4525</w:t>
+      </w:r>
+      <w:r>
+        <w:t xml:space="preserve"> in the folder </w:t>
+      </w:r>
+      <w:r>
+        <w:rPr>
+          <w:rFonts w:ascii="Menlo" w:cs="Menlo" w:eastAsia="Menlo" w:hAnsi="Menlo"/>
+          <w:sz w:val="18"/>
+          <w:szCs w:val="18"/>
+        </w:rPr>
+        <w:t xml:space="preserve">PyMOLMovies</w:t>
+      </w:r>
+      <w:r>
+        <w:t xml:space="preserve">.</w:t>
       </w:r>
     </w:p>
     <w:p>
@@ -56,7 +86,7 @@
         <w:spacing w:after="80"/>
       </w:pPr>
       <w:r>
-        <w:t xml:space="preserve">Open PyMOL.</w:t>
+        <w:t xml:space="preserve">Open the link above in a browser.</w:t>
       </w:r>
     </w:p>
     <w:p>
@@ -69,18 +99,7 @@
         <w:spacing w:after="80"/>
       </w:pPr>
       <w:r>
-        <w:t xml:space="preserve">Go to the workshop folder: </w:t>
-      </w:r>
-      <w:r>
-        <w:rPr>
-          <w:rFonts w:ascii="Menlo" w:cs="Menlo" w:eastAsia="Menlo" w:hAnsi="Menlo"/>
-          <w:sz w:val="18"/>
-          <w:szCs w:val="18"/>
-        </w:rPr>
-        <w:t xml:space="preserve">cd ~/Desktop/workshop</w:t>
-      </w:r>
-      <w:r>
-        <w:t xml:space="preserve"> (or wherever you put it).</w:t>
+        <w:t xml:space="preserve">Click the green Code button, then Download ZIP.</w:t>
       </w:r>
     </w:p>
     <w:p>
@@ -93,6 +112,173 @@
         <w:spacing w:after="80"/>
       </w:pPr>
       <w:r>
+        <w:t xml:space="preserve">Unzip it somewhere easy to find, such as the Desktop. You get a folder called </w:t>
+      </w:r>
+      <w:r>
+        <w:rPr>
+          <w:rFonts w:ascii="Menlo" w:cs="Menlo" w:eastAsia="Menlo" w:hAnsi="Menlo"/>
+          <w:sz w:val="18"/>
+          <w:szCs w:val="18"/>
+        </w:rPr>
+        <w:t xml:space="preserve">Tutorials_BIOL4525-main</w:t>
+      </w:r>
+      <w:r>
+        <w:t xml:space="preserve">. The workshop is the </w:t>
+      </w:r>
+      <w:r>
+        <w:rPr>
+          <w:rFonts w:ascii="Menlo" w:cs="Menlo" w:eastAsia="Menlo" w:hAnsi="Menlo"/>
+          <w:sz w:val="18"/>
+          <w:szCs w:val="18"/>
+        </w:rPr>
+        <w:t xml:space="preserve">PyMOLMovies</w:t>
+      </w:r>
+      <w:r>
+        <w:t xml:space="preserve"> folder inside it.</w:t>
+      </w:r>
+    </w:p>
+    <w:p>
+      <w:pPr>
+        <w:spacing w:after="100"/>
+      </w:pPr>
+      <w:r>
+        <w:t xml:space="preserve">Already use git? </w:t>
+      </w:r>
+      <w:r>
+        <w:rPr>
+          <w:rFonts w:ascii="Menlo" w:cs="Menlo" w:eastAsia="Menlo" w:hAnsi="Menlo"/>
+          <w:sz w:val="18"/>
+          <w:szCs w:val="18"/>
+        </w:rPr>
+        <w:t xml:space="preserve">git clone https://github.com/anshuJS/Tutorials_BIOL4525.git</w:t>
+      </w:r>
+      <w:r>
+        <w:t xml:space="preserve"> works too. No internet is needed once you have the files.</w:t>
+      </w:r>
+    </w:p>
+    <w:p>
+      <w:pPr>
+        <w:pStyle w:val="Heading1"/>
+      </w:pPr>
+      <w:r>
+        <w:t xml:space="preserve">Getting started</w:t>
+      </w:r>
+    </w:p>
+    <w:p>
+      <w:pPr>
+        <w:pStyle w:val="ListParagraph"/>
+        <w:numPr>
+          <w:ilvl w:val="0"/>
+          <w:numId w:val="3"/>
+        </w:numPr>
+        <w:spacing w:after="80"/>
+      </w:pPr>
+      <w:r>
+        <w:t xml:space="preserve">Open PyMOL.</w:t>
+      </w:r>
+    </w:p>
+    <w:p>
+      <w:pPr>
+        <w:pStyle w:val="ListParagraph"/>
+        <w:numPr>
+          <w:ilvl w:val="0"/>
+          <w:numId w:val="3"/>
+        </w:numPr>
+        <w:spacing w:after="80"/>
+      </w:pPr>
+      <w:r>
+        <w:t xml:space="preserve">Go to the workshop folder. Type this at the PyMOL&gt; prompt: </w:t>
+      </w:r>
+      <w:r>
+        <w:rPr>
+          <w:rFonts w:ascii="Menlo" w:cs="Menlo" w:eastAsia="Menlo" w:hAnsi="Menlo"/>
+          <w:sz w:val="18"/>
+          <w:szCs w:val="18"/>
+        </w:rPr>
+        <w:t xml:space="preserve">cd ~/Desktop/Tutorials_BIOL4525-main/PyMOLMovies</w:t>
+      </w:r>
+      <w:r>
+        <w:t xml:space="preserve"> (change the path if you unzipped somewhere else. On Windows it looks like </w:t>
+      </w:r>
+      <w:r>
+        <w:rPr>
+          <w:rFonts w:ascii="Menlo" w:cs="Menlo" w:eastAsia="Menlo" w:hAnsi="Menlo"/>
+          <w:sz w:val="18"/>
+          <w:szCs w:val="18"/>
+        </w:rPr>
+        <w:t xml:space="preserve">cd C:/Users/YOURNAME/Desktop/Tutorials_BIOL4525-main/PyMOLMovies</w:t>
+      </w:r>
+      <w:r>
+        <w:t xml:space="preserve">).</w:t>
+      </w:r>
+    </w:p>
+    <w:p>
+      <w:pPr>
+        <w:pStyle w:val="ListParagraph"/>
+        <w:numPr>
+          <w:ilvl w:val="0"/>
+          <w:numId w:val="3"/>
+        </w:numPr>
+        <w:spacing w:after="80"/>
+      </w:pPr>
+      <w:r>
+        <w:t xml:space="preserve">Check you are in the right place: </w:t>
+      </w:r>
+      <w:r>
+        <w:rPr>
+          <w:rFonts w:ascii="Menlo" w:cs="Menlo" w:eastAsia="Menlo" w:hAnsi="Menlo"/>
+          <w:sz w:val="18"/>
+          <w:szCs w:val="18"/>
+        </w:rPr>
+        <w:t xml:space="preserve">ls</w:t>
+      </w:r>
+      <w:r>
+        <w:t xml:space="preserve"> should list </w:t>
+      </w:r>
+      <w:r>
+        <w:rPr>
+          <w:rFonts w:ascii="Menlo" w:cs="Menlo" w:eastAsia="Menlo" w:hAnsi="Menlo"/>
+          <w:sz w:val="18"/>
+          <w:szCs w:val="18"/>
+        </w:rPr>
+        <w:t xml:space="preserve">steps</w:t>
+      </w:r>
+      <w:r>
+        <w:t xml:space="preserve">, </w:t>
+      </w:r>
+      <w:r>
+        <w:rPr>
+          <w:rFonts w:ascii="Menlo" w:cs="Menlo" w:eastAsia="Menlo" w:hAnsi="Menlo"/>
+          <w:sz w:val="18"/>
+          <w:szCs w:val="18"/>
+        </w:rPr>
+        <w:t xml:space="preserve">structures</w:t>
+      </w:r>
+      <w:r>
+        <w:t xml:space="preserve"> and </w:t>
+      </w:r>
+      <w:r>
+        <w:rPr>
+          <w:rFonts w:ascii="Menlo" w:cs="Menlo" w:eastAsia="Menlo" w:hAnsi="Menlo"/>
+          <w:sz w:val="18"/>
+          <w:szCs w:val="18"/>
+        </w:rPr>
+        <w:t xml:space="preserve">checkpoints</w:t>
+      </w:r>
+      <w:r>
+        <w:t xml:space="preserve">.</w:t>
+      </w:r>
+    </w:p>
+    <w:p>
+      <w:pPr>
+        <w:pStyle w:val="ListParagraph"/>
+        <w:numPr>
+          <w:ilvl w:val="0"/>
+          <w:numId w:val="3"/>
+        </w:numPr>
+        <w:spacing w:after="80"/>
+      </w:pPr>
+      <w:r>
         <w:t xml:space="preserve">Run a step: </w:t>
       </w:r>
       <w:r>
@@ -106,6 +292,19 @@
     </w:p>
     <w:p>
       <w:pPr>
+        <w:pStyle w:val="ListParagraph"/>
+        <w:numPr>
+          <w:ilvl w:val="0"/>
+          <w:numId w:val="3"/>
+        </w:numPr>
+        <w:spacing w:after="80"/>
+      </w:pPr>
+      <w:r>
+        <w:t xml:space="preserve">Open the same file in a text editor and read the comments as you go. Then run the next step.</w:t>
+      </w:r>
+    </w:p>
+    <w:p>
+      <w:pPr>
         <w:spacing w:after="100"/>
       </w:pPr>
       <w:r>
@@ -121,6 +320,47 @@
       </w:r>
       <w:r>
         <w:t xml:space="preserve"> and continue from step 3.</w:t>
+      </w:r>
+    </w:p>
+    <w:p>
+      <w:pPr>
+        <w:spacing w:after="100"/>
+      </w:pPr>
+      <w:r>
+        <w:t xml:space="preserve">Want to see the finished movie? </w:t>
+      </w:r>
+      <w:r>
+        <w:rPr>
+          <w:rFonts w:ascii="Menlo" w:cs="Menlo" w:eastAsia="Menlo" w:hAnsi="Menlo"/>
+          <w:sz w:val="18"/>
+          <w:szCs w:val="18"/>
+        </w:rPr>
+        <w:t xml:space="preserve">load sessions/AChE_workshop_final.pse</w:t>
+      </w:r>
+      <w:r>
+        <w:t xml:space="preserve">, type </w:t>
+      </w:r>
+      <w:r>
+        <w:rPr>
+          <w:rFonts w:ascii="Menlo" w:cs="Menlo" w:eastAsia="Menlo" w:hAnsi="Menlo"/>
+          <w:sz w:val="18"/>
+          <w:szCs w:val="18"/>
+        </w:rPr>
+        <w:t xml:space="preserve">accept</w:t>
+      </w:r>
+      <w:r>
+        <w:t xml:space="preserve"> at the security warning, then </w:t>
+      </w:r>
+      <w:r>
+        <w:rPr>
+          <w:rFonts w:ascii="Menlo" w:cs="Menlo" w:eastAsia="Menlo" w:hAnsi="Menlo"/>
+          <w:sz w:val="18"/>
+          <w:szCs w:val="18"/>
+        </w:rPr>
+        <w:t xml:space="preserve">mplay</w:t>
+      </w:r>
+      <w:r>
+        <w:t xml:space="preserve">.</w:t>
       </w:r>
     </w:p>
     <w:p>
@@ -2853,7 +3093,7 @@
         <w:pStyle w:val="ListParagraph"/>
         <w:numPr>
           <w:ilvl w:val="0"/>
-          <w:numId w:val="3"/>
+          <w:numId w:val="4"/>
         </w:numPr>
         <w:spacing w:after="80"/>
       </w:pPr>
@@ -2866,7 +3106,7 @@
         <w:pStyle w:val="ListParagraph"/>
         <w:numPr>
           <w:ilvl w:val="0"/>
-          <w:numId w:val="3"/>
+          <w:numId w:val="4"/>
         </w:numPr>
         <w:spacing w:after="80"/>
       </w:pPr>
@@ -2912,7 +3152,7 @@
         <w:pStyle w:val="ListParagraph"/>
         <w:numPr>
           <w:ilvl w:val="0"/>
-          <w:numId w:val="3"/>
+          <w:numId w:val="4"/>
         </w:numPr>
         <w:spacing w:after="80"/>
       </w:pPr>
@@ -2925,7 +3165,7 @@
         <w:pStyle w:val="ListParagraph"/>
         <w:numPr>
           <w:ilvl w:val="0"/>
-          <w:numId w:val="3"/>
+          <w:numId w:val="4"/>
         </w:numPr>
         <w:spacing w:after="80"/>
       </w:pPr>
@@ -2949,7 +3189,7 @@
         <w:pStyle w:val="ListParagraph"/>
         <w:numPr>
           <w:ilvl w:val="0"/>
-          <w:numId w:val="3"/>
+          <w:numId w:val="4"/>
         </w:numPr>
         <w:spacing w:after="80"/>
       </w:pPr>
@@ -2973,7 +3213,7 @@
         <w:pStyle w:val="ListParagraph"/>
         <w:numPr>
           <w:ilvl w:val="0"/>
-          <w:numId w:val="3"/>
+          <w:numId w:val="4"/>
         </w:numPr>
         <w:spacing w:after="80"/>
       </w:pPr>
@@ -3019,7 +3259,7 @@
         <w:pStyle w:val="ListParagraph"/>
         <w:numPr>
           <w:ilvl w:val="0"/>
-          <w:numId w:val="3"/>
+          <w:numId w:val="4"/>
         </w:numPr>
         <w:spacing w:after="80"/>
       </w:pPr>
@@ -3054,7 +3294,7 @@
         <w:pStyle w:val="ListParagraph"/>
         <w:numPr>
           <w:ilvl w:val="0"/>
-          <w:numId w:val="3"/>
+          <w:numId w:val="4"/>
         </w:numPr>
         <w:spacing w:after="80"/>
       </w:pPr>
@@ -3844,6 +4084,18 @@
       </w:pPr>
     </w:lvl>
   </w:abstractNum>
+  <w:abstractNum w:abstractNumId="4" w15:restartNumberingAfterBreak="0">
+    <w:multiLevelType w:val="hybridMultilevel"/>
+    <w:lvl w:ilvl="0" w:tentative="1">
+      <w:start w:val="1"/>
+      <w:numFmt w:val="decimal"/>
+      <w:lvlText w:val="%1."/>
+      <w:lvlJc w:val="left"/>
+      <w:pPr>
+        <w:ind w:left="540" w:hanging="360"/>
+      </w:pPr>
+    </w:lvl>
+  </w:abstractNum>
   <w:num w:numId="1">
     <w:abstractNumId w:val="1"/>
     <w:lvlOverride w:ilvl="0">
@@ -3858,6 +4110,12 @@
   </w:num>
   <w:num w:numId="3">
     <w:abstractNumId w:val="3"/>
+    <w:lvlOverride w:ilvl="0">
+      <w:startOverride w:val="1"/>
+    </w:lvlOverride>
+  </w:num>
+  <w:num w:numId="4">
+    <w:abstractNumId w:val="4"/>
     <w:lvlOverride w:ilvl="0">
       <w:startOverride w:val="1"/>
     </w:lvlOverride>

</xml_diff>

<commit_message>
PyMOLMovies: add step 9 (your project figure as a movie) and update handout
Co-Authored-By: Claude Opus 5.5 <noreply@anthropic.com>
</commit_message>
<xml_diff>
--- a/PyMOLMovies/PyMOL_Movies_Handout.docx
+++ b/PyMOLMovies/PyMOL_Movies_Handout.docx
@@ -1077,7 +1077,83 @@
           </w:tcPr>
           <w:p>
             <w:r>
-              <w:t xml:space="preserve">make your own 15 s movie</w:t>
+              <w:t xml:space="preserve">optional: a 15 s huperzine A movie</w:t>
+            </w:r>
+          </w:p>
+        </w:tc>
+      </w:tr>
+      <w:tr>
+        <w:trPr>
+          <w:tblHeader w:val="off"/>
+        </w:trPr>
+        <w:tc>
+          <w:tcPr>
+            <w:tcW w:type="dxa" w:w="900"/>
+            <w:tcBorders>
+              <w:top w:val="single" w:color="BBBBBB" w:sz="4"/>
+              <w:left w:val="single" w:color="BBBBBB" w:sz="4"/>
+              <w:bottom w:val="single" w:color="BBBBBB" w:sz="4"/>
+              <w:right w:val="single" w:color="BBBBBB" w:sz="4"/>
+            </w:tcBorders>
+            <w:tcMar>
+              <w:top w:type="dxa" w:w="60"/>
+              <w:left w:type="dxa" w:w="100"/>
+              <w:bottom w:type="dxa" w:w="60"/>
+              <w:right w:type="dxa" w:w="100"/>
+            </w:tcMar>
+          </w:tcPr>
+          <w:p>
+            <w:r>
+              <w:t xml:space="preserve">9</w:t>
+            </w:r>
+          </w:p>
+        </w:tc>
+        <w:tc>
+          <w:tcPr>
+            <w:tcW w:type="dxa" w:w="3300"/>
+            <w:tcBorders>
+              <w:top w:val="single" w:color="BBBBBB" w:sz="4"/>
+              <w:left w:val="single" w:color="BBBBBB" w:sz="4"/>
+              <w:bottom w:val="single" w:color="BBBBBB" w:sz="4"/>
+              <w:right w:val="single" w:color="BBBBBB" w:sz="4"/>
+            </w:tcBorders>
+            <w:tcMar>
+              <w:top w:type="dxa" w:w="60"/>
+              <w:left w:type="dxa" w:w="100"/>
+              <w:bottom w:type="dxa" w:w="60"/>
+              <w:right w:type="dxa" w:w="100"/>
+            </w:tcMar>
+          </w:tcPr>
+          <w:p>
+            <w:r>
+              <w:rPr>
+                <w:rFonts w:ascii="Menlo" w:cs="Menlo" w:eastAsia="Menlo" w:hAnsi="Menlo"/>
+                <w:sz w:val="18"/>
+                <w:szCs w:val="18"/>
+              </w:rPr>
+              <w:t xml:space="preserve">09_your_figure_movie.pml</w:t>
+            </w:r>
+          </w:p>
+        </w:tc>
+        <w:tc>
+          <w:tcPr>
+            <w:tcW w:type="dxa" w:w="5160"/>
+            <w:tcBorders>
+              <w:top w:val="single" w:color="BBBBBB" w:sz="4"/>
+              <w:left w:val="single" w:color="BBBBBB" w:sz="4"/>
+              <w:bottom w:val="single" w:color="BBBBBB" w:sz="4"/>
+              <w:right w:val="single" w:color="BBBBBB" w:sz="4"/>
+            </w:tcBorders>
+            <w:tcMar>
+              <w:top w:type="dxa" w:w="60"/>
+              <w:left w:type="dxa" w:w="100"/>
+              <w:bottom w:type="dxa" w:w="60"/>
+              <w:right w:type="dxa" w:w="100"/>
+            </w:tcMar>
+          </w:tcPr>
+          <w:p>
+            <w:r>
+              <w:t xml:space="preserve">your project figure as a movie (in class, in teams)</w:t>
             </w:r>
           </w:p>
         </w:tc>
@@ -3323,7 +3399,705 @@
         <w:pStyle w:val="Heading1"/>
       </w:pPr>
       <w:r>
-        <w:t xml:space="preserve">Plan your movie (step 8)</w:t>
+        <w:t xml:space="preserve">Step 9: your project figure as a movie</w:t>
+      </w:r>
+    </w:p>
+    <w:p>
+      <w:pPr>
+        <w:spacing w:after="100"/>
+      </w:pPr>
+      <w:r>
+        <w:t xml:space="preserve">You already have a </w:t>
+      </w:r>
+      <w:r>
+        <w:rPr>
+          <w:rFonts w:ascii="Menlo" w:cs="Menlo" w:eastAsia="Menlo" w:hAnsi="Menlo"/>
+          <w:sz w:val="18"/>
+          <w:szCs w:val="18"/>
+        </w:rPr>
+        <w:t xml:space="preserve">.pml</w:t>
+      </w:r>
+      <w:r>
+        <w:t xml:space="preserve"> script that makes a figure for your paper. It sets the colours, the representations and the camera. That is exactly what a scene needs. In about 20 minutes, as a team, you will turn it into a 12 second movie:</w:t>
+      </w:r>
+    </w:p>
+    <w:tbl>
+      <w:tblPr>
+        <w:tblW w:type="dxa" w:w="9360"/>
+        <w:tblBorders>
+          <w:top w:val="single" w:color="auto" w:sz="4"/>
+          <w:left w:val="single" w:color="auto" w:sz="4"/>
+          <w:bottom w:val="single" w:color="auto" w:sz="4"/>
+          <w:right w:val="single" w:color="auto" w:sz="4"/>
+          <w:insideH w:val="single" w:color="auto" w:sz="4"/>
+          <w:insideV w:val="single" w:color="auto" w:sz="4"/>
+        </w:tblBorders>
+      </w:tblPr>
+      <w:tblGrid>
+        <w:gridCol w:w="1500"/>
+        <w:gridCol w:w="7860"/>
+      </w:tblGrid>
+      <w:tr>
+        <w:trPr>
+          <w:tblHeader/>
+        </w:trPr>
+        <w:tc>
+          <w:tcPr>
+            <w:tcW w:type="dxa" w:w="1500"/>
+            <w:tcBorders>
+              <w:top w:val="single" w:color="BBBBBB" w:sz="4"/>
+              <w:left w:val="single" w:color="BBBBBB" w:sz="4"/>
+              <w:bottom w:val="single" w:color="BBBBBB" w:sz="4"/>
+              <w:right w:val="single" w:color="BBBBBB" w:sz="4"/>
+            </w:tcBorders>
+            <w:shd w:fill="EDE6F7" w:color="auto" w:val="clear"/>
+            <w:tcMar>
+              <w:top w:type="dxa" w:w="60"/>
+              <w:left w:type="dxa" w:w="100"/>
+              <w:bottom w:type="dxa" w:w="60"/>
+              <w:right w:type="dxa" w:w="100"/>
+            </w:tcMar>
+          </w:tcPr>
+          <w:p>
+            <w:r>
+              <w:rPr>
+                <w:b/>
+                <w:bCs/>
+              </w:rPr>
+              <w:t xml:space="preserve">Shot</w:t>
+            </w:r>
+          </w:p>
+        </w:tc>
+        <w:tc>
+          <w:tcPr>
+            <w:tcW w:type="dxa" w:w="7860"/>
+            <w:tcBorders>
+              <w:top w:val="single" w:color="BBBBBB" w:sz="4"/>
+              <w:left w:val="single" w:color="BBBBBB" w:sz="4"/>
+              <w:bottom w:val="single" w:color="BBBBBB" w:sz="4"/>
+              <w:right w:val="single" w:color="BBBBBB" w:sz="4"/>
+            </w:tcBorders>
+            <w:shd w:fill="EDE6F7" w:color="auto" w:val="clear"/>
+            <w:tcMar>
+              <w:top w:type="dxa" w:w="60"/>
+              <w:left w:type="dxa" w:w="100"/>
+              <w:bottom w:type="dxa" w:w="60"/>
+              <w:right w:type="dxa" w:w="100"/>
+            </w:tcMar>
+          </w:tcPr>
+          <w:p>
+            <w:r>
+              <w:rPr>
+                <w:b/>
+                <w:bCs/>
+              </w:rPr>
+              <w:t xml:space="preserve">What it shows</w:t>
+            </w:r>
+          </w:p>
+        </w:tc>
+      </w:tr>
+      <w:tr>
+        <w:trPr>
+          <w:tblHeader w:val="off"/>
+        </w:trPr>
+        <w:tc>
+          <w:tcPr>
+            <w:tcW w:type="dxa" w:w="1500"/>
+            <w:tcBorders>
+              <w:top w:val="single" w:color="BBBBBB" w:sz="4"/>
+              <w:left w:val="single" w:color="BBBBBB" w:sz="4"/>
+              <w:bottom w:val="single" w:color="BBBBBB" w:sz="4"/>
+              <w:right w:val="single" w:color="BBBBBB" w:sz="4"/>
+            </w:tcBorders>
+            <w:tcMar>
+              <w:top w:type="dxa" w:w="60"/>
+              <w:left w:type="dxa" w:w="100"/>
+              <w:bottom w:type="dxa" w:w="60"/>
+              <w:right w:type="dxa" w:w="100"/>
+            </w:tcMar>
+          </w:tcPr>
+          <w:p>
+            <w:r>
+              <w:t xml:space="preserve">1  wide</w:t>
+            </w:r>
+          </w:p>
+        </w:tc>
+        <w:tc>
+          <w:tcPr>
+            <w:tcW w:type="dxa" w:w="7860"/>
+            <w:tcBorders>
+              <w:top w:val="single" w:color="BBBBBB" w:sz="4"/>
+              <w:left w:val="single" w:color="BBBBBB" w:sz="4"/>
+              <w:bottom w:val="single" w:color="BBBBBB" w:sz="4"/>
+              <w:right w:val="single" w:color="BBBBBB" w:sz="4"/>
+            </w:tcBorders>
+            <w:tcMar>
+              <w:top w:type="dxa" w:w="60"/>
+              <w:left w:type="dxa" w:w="100"/>
+              <w:bottom w:type="dxa" w:w="60"/>
+              <w:right w:type="dxa" w:w="100"/>
+            </w:tcMar>
+          </w:tcPr>
+          <w:p>
+            <w:r>
+              <w:t xml:space="preserve">the whole protein, so the viewer knows where we are</w:t>
+            </w:r>
+          </w:p>
+        </w:tc>
+      </w:tr>
+      <w:tr>
+        <w:trPr>
+          <w:tblHeader w:val="off"/>
+        </w:trPr>
+        <w:tc>
+          <w:tcPr>
+            <w:tcW w:type="dxa" w:w="1500"/>
+            <w:tcBorders>
+              <w:top w:val="single" w:color="BBBBBB" w:sz="4"/>
+              <w:left w:val="single" w:color="BBBBBB" w:sz="4"/>
+              <w:bottom w:val="single" w:color="BBBBBB" w:sz="4"/>
+              <w:right w:val="single" w:color="BBBBBB" w:sz="4"/>
+            </w:tcBorders>
+            <w:tcMar>
+              <w:top w:type="dxa" w:w="60"/>
+              <w:left w:type="dxa" w:w="100"/>
+              <w:bottom w:type="dxa" w:w="60"/>
+              <w:right w:type="dxa" w:w="100"/>
+            </w:tcMar>
+          </w:tcPr>
+          <w:p>
+            <w:r>
+              <w:t xml:space="preserve">2  figure</w:t>
+            </w:r>
+          </w:p>
+        </w:tc>
+        <w:tc>
+          <w:tcPr>
+            <w:tcW w:type="dxa" w:w="7860"/>
+            <w:tcBorders>
+              <w:top w:val="single" w:color="BBBBBB" w:sz="4"/>
+              <w:left w:val="single" w:color="BBBBBB" w:sz="4"/>
+              <w:bottom w:val="single" w:color="BBBBBB" w:sz="4"/>
+              <w:right w:val="single" w:color="BBBBBB" w:sz="4"/>
+            </w:tcBorders>
+            <w:tcMar>
+              <w:top w:type="dxa" w:w="60"/>
+              <w:left w:type="dxa" w:w="100"/>
+              <w:bottom w:type="dxa" w:w="60"/>
+              <w:right w:type="dxa" w:w="100"/>
+            </w:tcMar>
+          </w:tcPr>
+          <w:p>
+            <w:r>
+              <w:t xml:space="preserve">your figure, exactly as it appears in the paper</w:t>
+            </w:r>
+          </w:p>
+        </w:tc>
+      </w:tr>
+      <w:tr>
+        <w:trPr>
+          <w:tblHeader w:val="off"/>
+        </w:trPr>
+        <w:tc>
+          <w:tcPr>
+            <w:tcW w:type="dxa" w:w="1500"/>
+            <w:tcBorders>
+              <w:top w:val="single" w:color="BBBBBB" w:sz="4"/>
+              <w:left w:val="single" w:color="BBBBBB" w:sz="4"/>
+              <w:bottom w:val="single" w:color="BBBBBB" w:sz="4"/>
+              <w:right w:val="single" w:color="BBBBBB" w:sz="4"/>
+            </w:tcBorders>
+            <w:tcMar>
+              <w:top w:type="dxa" w:w="60"/>
+              <w:left w:type="dxa" w:w="100"/>
+              <w:bottom w:type="dxa" w:w="60"/>
+              <w:right w:type="dxa" w:w="100"/>
+            </w:tcMar>
+          </w:tcPr>
+          <w:p>
+            <w:r>
+              <w:t xml:space="preserve">3  close-up</w:t>
+            </w:r>
+          </w:p>
+        </w:tc>
+        <w:tc>
+          <w:tcPr>
+            <w:tcW w:type="dxa" w:w="7860"/>
+            <w:tcBorders>
+              <w:top w:val="single" w:color="BBBBBB" w:sz="4"/>
+              <w:left w:val="single" w:color="BBBBBB" w:sz="4"/>
+              <w:bottom w:val="single" w:color="BBBBBB" w:sz="4"/>
+              <w:right w:val="single" w:color="BBBBBB" w:sz="4"/>
+            </w:tcBorders>
+            <w:tcMar>
+              <w:top w:type="dxa" w:w="60"/>
+              <w:left w:type="dxa" w:w="100"/>
+              <w:bottom w:type="dxa" w:w="60"/>
+              <w:right w:type="dxa" w:w="100"/>
+            </w:tcMar>
+          </w:tcPr>
+          <w:p>
+            <w:r>
+              <w:t xml:space="preserve">the part your figure is about, with a gentle rock to finish</w:t>
+            </w:r>
+          </w:p>
+        </w:tc>
+      </w:tr>
+    </w:tbl>
+    <w:p>
+      <w:pPr>
+        <w:spacing w:after="120"/>
+      </w:pPr>
+    </w:p>
+    <w:p>
+      <w:pPr>
+        <w:pStyle w:val="Heading2"/>
+      </w:pPr>
+      <w:r>
+        <w:t xml:space="preserve">Before you start</w:t>
+      </w:r>
+    </w:p>
+    <w:p>
+      <w:pPr>
+        <w:pStyle w:val="ListParagraph"/>
+        <w:numPr>
+          <w:ilvl w:val="0"/>
+          <w:numId w:val="5"/>
+        </w:numPr>
+        <w:spacing w:after="80"/>
+      </w:pPr>
+      <w:r>
+        <w:t xml:space="preserve">Find your figure script. It is the </w:t>
+      </w:r>
+      <w:r>
+        <w:rPr>
+          <w:rFonts w:ascii="Menlo" w:cs="Menlo" w:eastAsia="Menlo" w:hAnsi="Menlo"/>
+          <w:sz w:val="18"/>
+          <w:szCs w:val="18"/>
+        </w:rPr>
+        <w:t xml:space="preserve">.pml</w:t>
+      </w:r>
+      <w:r>
+        <w:t xml:space="preserve"> file your team uploaded with your figures.</w:t>
+      </w:r>
+    </w:p>
+    <w:p>
+      <w:pPr>
+        <w:pStyle w:val="ListParagraph"/>
+        <w:numPr>
+          <w:ilvl w:val="0"/>
+          <w:numId w:val="5"/>
+        </w:numPr>
+        <w:spacing w:after="80"/>
+      </w:pPr>
+      <w:r>
+        <w:t xml:space="preserve">Copy it and open the copy in a text editor.</w:t>
+      </w:r>
+    </w:p>
+    <w:p>
+      <w:pPr>
+        <w:pStyle w:val="ListParagraph"/>
+        <w:numPr>
+          <w:ilvl w:val="0"/>
+          <w:numId w:val="5"/>
+        </w:numPr>
+        <w:spacing w:after="80"/>
+      </w:pPr>
+      <w:r>
+        <w:t xml:space="preserve">Put a </w:t>
+      </w:r>
+      <w:r>
+        <w:rPr>
+          <w:rFonts w:ascii="Menlo" w:cs="Menlo" w:eastAsia="Menlo" w:hAnsi="Menlo"/>
+          <w:sz w:val="18"/>
+          <w:szCs w:val="18"/>
+        </w:rPr>
+        <w:t xml:space="preserve">#</w:t>
+      </w:r>
+      <w:r>
+        <w:t xml:space="preserve"> in front of every </w:t>
+      </w:r>
+      <w:r>
+        <w:rPr>
+          <w:rFonts w:ascii="Menlo" w:cs="Menlo" w:eastAsia="Menlo" w:hAnsi="Menlo"/>
+          <w:sz w:val="18"/>
+          <w:szCs w:val="18"/>
+        </w:rPr>
+        <w:t xml:space="preserve">ray</w:t>
+      </w:r>
+      <w:r>
+        <w:t xml:space="preserve"> line and every </w:t>
+      </w:r>
+      <w:r>
+        <w:rPr>
+          <w:rFonts w:ascii="Menlo" w:cs="Menlo" w:eastAsia="Menlo" w:hAnsi="Menlo"/>
+          <w:sz w:val="18"/>
+          <w:szCs w:val="18"/>
+        </w:rPr>
+        <w:t xml:space="preserve">png</w:t>
+      </w:r>
+      <w:r>
+        <w:t xml:space="preserve"> line. They are slow and would overwrite your figure image.</w:t>
+      </w:r>
+    </w:p>
+    <w:p>
+      <w:pPr>
+        <w:pStyle w:val="ListParagraph"/>
+        <w:numPr>
+          <w:ilvl w:val="0"/>
+          <w:numId w:val="5"/>
+        </w:numPr>
+        <w:spacing w:after="80"/>
+      </w:pPr>
+      <w:r>
+        <w:t xml:space="preserve">If a </w:t>
+      </w:r>
+      <w:r>
+        <w:rPr>
+          <w:rFonts w:ascii="Menlo" w:cs="Menlo" w:eastAsia="Menlo" w:hAnsi="Menlo"/>
+          <w:sz w:val="18"/>
+          <w:szCs w:val="18"/>
+        </w:rPr>
+        <w:t xml:space="preserve">load</w:t>
+      </w:r>
+      <w:r>
+        <w:t xml:space="preserve"> line points to a file that is not on this computer, change the path, or replace the line with </w:t>
+      </w:r>
+      <w:r>
+        <w:rPr>
+          <w:rFonts w:ascii="Menlo" w:cs="Menlo" w:eastAsia="Menlo" w:hAnsi="Menlo"/>
+          <w:sz w:val="18"/>
+          <w:szCs w:val="18"/>
+        </w:rPr>
+        <w:t xml:space="preserve">fetch XXXX</w:t>
+      </w:r>
+      <w:r>
+        <w:t xml:space="preserve"> (the PDB code).</w:t>
+      </w:r>
+    </w:p>
+    <w:p>
+      <w:pPr>
+        <w:pStyle w:val="Heading2"/>
+      </w:pPr>
+      <w:r>
+        <w:t xml:space="preserve">Make the movie</w:t>
+      </w:r>
+    </w:p>
+    <w:p>
+      <w:pPr>
+        <w:pStyle w:val="ListParagraph"/>
+        <w:numPr>
+          <w:ilvl w:val="0"/>
+          <w:numId w:val="6"/>
+        </w:numPr>
+        <w:spacing w:after="80"/>
+      </w:pPr>
+      <w:r>
+        <w:t xml:space="preserve">Open </w:t>
+      </w:r>
+      <w:r>
+        <w:rPr>
+          <w:rFonts w:ascii="Menlo" w:cs="Menlo" w:eastAsia="Menlo" w:hAnsi="Menlo"/>
+          <w:sz w:val="18"/>
+          <w:szCs w:val="18"/>
+        </w:rPr>
+        <w:t xml:space="preserve">steps/09_your_figure_movie.pml</w:t>
+      </w:r>
+      <w:r>
+        <w:t xml:space="preserve"> in a text editor. Every blank to fill in is written as </w:t>
+      </w:r>
+      <w:r>
+        <w:rPr>
+          <w:rFonts w:ascii="Menlo" w:cs="Menlo" w:eastAsia="Menlo" w:hAnsi="Menlo"/>
+          <w:sz w:val="18"/>
+          <w:szCs w:val="18"/>
+        </w:rPr>
+        <w:t xml:space="preserve">____</w:t>
+      </w:r>
+      <w:r>
+        <w:t xml:space="preserve">.</w:t>
+      </w:r>
+    </w:p>
+    <w:p>
+      <w:pPr>
+        <w:pStyle w:val="ListParagraph"/>
+        <w:numPr>
+          <w:ilvl w:val="0"/>
+          <w:numId w:val="6"/>
+        </w:numPr>
+        <w:spacing w:after="80"/>
+      </w:pPr>
+      <w:r>
+        <w:t xml:space="preserve">Line </w:t>
+      </w:r>
+      <w:r>
+        <w:rPr>
+          <w:rFonts w:ascii="Menlo" w:cs="Menlo" w:eastAsia="Menlo" w:hAnsi="Menlo"/>
+          <w:sz w:val="18"/>
+          <w:szCs w:val="18"/>
+        </w:rPr>
+        <w:t xml:space="preserve">@____/your_figure.pml</w:t>
+      </w:r>
+      <w:r>
+        <w:t xml:space="preserve">: put the path to your edited figure script.</w:t>
+      </w:r>
+    </w:p>
+    <w:p>
+      <w:pPr>
+        <w:pStyle w:val="ListParagraph"/>
+        <w:numPr>
+          <w:ilvl w:val="0"/>
+          <w:numId w:val="6"/>
+        </w:numPr>
+        <w:spacing w:after="80"/>
+      </w:pPr>
+      <w:r>
+        <w:t xml:space="preserve">Fill in the three captions (</w:t>
+      </w:r>
+      <w:r>
+        <w:rPr>
+          <w:rFonts w:ascii="Menlo" w:cs="Menlo" w:eastAsia="Menlo" w:hAnsi="Menlo"/>
+          <w:sz w:val="18"/>
+          <w:szCs w:val="18"/>
+        </w:rPr>
+        <w:t xml:space="preserve">message=</w:t>
+      </w:r>
+      <w:r>
+        <w:t xml:space="preserve">). No commas.</w:t>
+      </w:r>
+    </w:p>
+    <w:p>
+      <w:pPr>
+        <w:pStyle w:val="ListParagraph"/>
+        <w:numPr>
+          <w:ilvl w:val="0"/>
+          <w:numId w:val="6"/>
+        </w:numPr>
+        <w:spacing w:after="80"/>
+      </w:pPr>
+      <w:r>
+        <w:t xml:space="preserve">Fill in the close-up: a SMALL selection with the chain named, for example </w:t>
+      </w:r>
+      <w:r>
+        <w:rPr>
+          <w:rFonts w:ascii="Menlo" w:cs="Menlo" w:eastAsia="Menlo" w:hAnsi="Menlo"/>
+          <w:sz w:val="18"/>
+          <w:szCs w:val="18"/>
+        </w:rPr>
+        <w:t xml:space="preserve">zoom chain A and resn NAP, 3</w:t>
+      </w:r>
+      <w:r>
+        <w:t xml:space="preserve">. A </w:t>
+      </w:r>
+      <w:r>
+        <w:rPr>
+          <w:rFonts w:ascii="Menlo" w:cs="Menlo" w:eastAsia="Menlo" w:hAnsi="Menlo"/>
+          <w:sz w:val="18"/>
+          <w:szCs w:val="18"/>
+        </w:rPr>
+        <w:t xml:space="preserve">select</w:t>
+      </w:r>
+      <w:r>
+        <w:t xml:space="preserve"> line in your own script often gives you one ready-made.</w:t>
+      </w:r>
+    </w:p>
+    <w:p>
+      <w:pPr>
+        <w:pStyle w:val="ListParagraph"/>
+        <w:numPr>
+          <w:ilvl w:val="0"/>
+          <w:numId w:val="6"/>
+        </w:numPr>
+        <w:spacing w:after="80"/>
+      </w:pPr>
+      <w:r>
+        <w:t xml:space="preserve">Save the file and run it: </w:t>
+      </w:r>
+      <w:r>
+        <w:rPr>
+          <w:rFonts w:ascii="Menlo" w:cs="Menlo" w:eastAsia="Menlo" w:hAnsi="Menlo"/>
+          <w:sz w:val="18"/>
+          <w:szCs w:val="18"/>
+        </w:rPr>
+        <w:t xml:space="preserve">@steps/09_your_figure_movie.pml</w:t>
+      </w:r>
+    </w:p>
+    <w:p>
+      <w:pPr>
+        <w:pStyle w:val="ListParagraph"/>
+        <w:numPr>
+          <w:ilvl w:val="0"/>
+          <w:numId w:val="6"/>
+        </w:numPr>
+        <w:spacing w:after="80"/>
+      </w:pPr>
+      <w:r>
+        <w:t xml:space="preserve">Press play. Change the keyframe numbers until the timing feels right, run again.</w:t>
+      </w:r>
+    </w:p>
+    <w:p>
+      <w:pPr>
+        <w:pStyle w:val="ListParagraph"/>
+        <w:numPr>
+          <w:ilvl w:val="0"/>
+          <w:numId w:val="6"/>
+        </w:numPr>
+        <w:spacing w:after="80"/>
+      </w:pPr>
+      <w:r>
+        <w:t xml:space="preserve">Save the session: </w:t>
+      </w:r>
+      <w:r>
+        <w:rPr>
+          <w:rFonts w:ascii="Menlo" w:cs="Menlo" w:eastAsia="Menlo" w:hAnsi="Menlo"/>
+          <w:sz w:val="18"/>
+          <w:szCs w:val="18"/>
+        </w:rPr>
+        <w:t xml:space="preserve">save my_figure_movie.pse</w:t>
+      </w:r>
+      <w:r>
+        <w:t xml:space="preserve">. Render it later (step 7).</w:t>
+      </w:r>
+    </w:p>
+    <w:p>
+      <w:pPr>
+        <w:pStyle w:val="Heading2"/>
+      </w:pPr>
+      <w:r>
+        <w:t xml:space="preserve">Stretch: two panels as two scenes</w:t>
+      </w:r>
+    </w:p>
+    <w:p>
+      <w:pPr>
+        <w:spacing w:after="100"/>
+      </w:pPr>
+      <w:r>
+        <w:t xml:space="preserve">If your figure has panels A and B, make one scene per panel and fly between them. Panel B's script must not undo panel A: in a copy of panel B's script, put a </w:t>
+      </w:r>
+      <w:r>
+        <w:rPr>
+          <w:rFonts w:ascii="Menlo" w:cs="Menlo" w:eastAsia="Menlo" w:hAnsi="Menlo"/>
+          <w:sz w:val="18"/>
+          <w:szCs w:val="18"/>
+        </w:rPr>
+        <w:t xml:space="preserve">#</w:t>
+      </w:r>
+      <w:r>
+        <w:t xml:space="preserve"> in front of </w:t>
+      </w:r>
+      <w:r>
+        <w:rPr>
+          <w:rFonts w:ascii="Menlo" w:cs="Menlo" w:eastAsia="Menlo" w:hAnsi="Menlo"/>
+          <w:sz w:val="18"/>
+          <w:szCs w:val="18"/>
+        </w:rPr>
+        <w:t xml:space="preserve">delete all</w:t>
+      </w:r>
+      <w:r>
+        <w:t xml:space="preserve">, </w:t>
+      </w:r>
+      <w:r>
+        <w:rPr>
+          <w:rFonts w:ascii="Menlo" w:cs="Menlo" w:eastAsia="Menlo" w:hAnsi="Menlo"/>
+          <w:sz w:val="18"/>
+          <w:szCs w:val="18"/>
+        </w:rPr>
+        <w:t xml:space="preserve">reinitialize</w:t>
+      </w:r>
+      <w:r>
+        <w:t xml:space="preserve">, any </w:t>
+      </w:r>
+      <w:r>
+        <w:rPr>
+          <w:rFonts w:ascii="Menlo" w:cs="Menlo" w:eastAsia="Menlo" w:hAnsi="Menlo"/>
+          <w:sz w:val="18"/>
+          <w:szCs w:val="18"/>
+        </w:rPr>
+        <w:t xml:space="preserve">fetch</w:t>
+      </w:r>
+      <w:r>
+        <w:t xml:space="preserve"> or </w:t>
+      </w:r>
+      <w:r>
+        <w:rPr>
+          <w:rFonts w:ascii="Menlo" w:cs="Menlo" w:eastAsia="Menlo" w:hAnsi="Menlo"/>
+          <w:sz w:val="18"/>
+          <w:szCs w:val="18"/>
+        </w:rPr>
+        <w:t xml:space="preserve">load</w:t>
+      </w:r>
+      <w:r>
+        <w:t xml:space="preserve"> of a structure that is already loaded, and </w:t>
+      </w:r>
+      <w:r>
+        <w:rPr>
+          <w:rFonts w:ascii="Menlo" w:cs="Menlo" w:eastAsia="Menlo" w:hAnsi="Menlo"/>
+          <w:sz w:val="18"/>
+          <w:szCs w:val="18"/>
+        </w:rPr>
+        <w:t xml:space="preserve">remove</w:t>
+      </w:r>
+      <w:r>
+        <w:t xml:space="preserve"> lines. The template at the bottom of step 9 shows the commands.</w:t>
+      </w:r>
+    </w:p>
+    <w:p>
+      <w:pPr>
+        <w:spacing w:after="100"/>
+      </w:pPr>
+      <w:r>
+        <w:t xml:space="preserve">Settings such as </w:t>
+      </w:r>
+      <w:r>
+        <w:rPr>
+          <w:rFonts w:ascii="Menlo" w:cs="Menlo" w:eastAsia="Menlo" w:hAnsi="Menlo"/>
+          <w:sz w:val="18"/>
+          <w:szCs w:val="18"/>
+        </w:rPr>
+        <w:t xml:space="preserve">bg_color</w:t>
+      </w:r>
+      <w:r>
+        <w:t xml:space="preserve"> and </w:t>
+      </w:r>
+      <w:r>
+        <w:rPr>
+          <w:rFonts w:ascii="Menlo" w:cs="Menlo" w:eastAsia="Menlo" w:hAnsi="Menlo"/>
+          <w:sz w:val="18"/>
+          <w:szCs w:val="18"/>
+        </w:rPr>
+        <w:t xml:space="preserve">cartoon_transparency</w:t>
+      </w:r>
+      <w:r>
+        <w:t xml:space="preserve"> are not stored in scenes, so the last script to set them wins for both panels.</w:t>
+      </w:r>
+    </w:p>
+    <w:p>
+      <w:pPr>
+        <w:pStyle w:val="Heading2"/>
+      </w:pPr>
+      <w:r>
+        <w:t xml:space="preserve">Show and tell</w:t>
+      </w:r>
+    </w:p>
+    <w:p>
+      <w:pPr>
+        <w:spacing w:after="100"/>
+      </w:pPr>
+      <w:r>
+        <w:t xml:space="preserve">At the end, each team plays its movie from the front. 30 seconds each.</w:t>
+      </w:r>
+    </w:p>
+    <w:p>
+      <w:r>
+        <w:br w:type="page"/>
+      </w:r>
+    </w:p>
+    <w:p>
+      <w:pPr>
+        <w:pStyle w:val="Heading1"/>
+      </w:pPr>
+      <w:r>
+        <w:t xml:space="preserve">Plan your movie (optional step 8)</w:t>
       </w:r>
     </w:p>
     <w:p>
@@ -4096,6 +4870,30 @@
       </w:pPr>
     </w:lvl>
   </w:abstractNum>
+  <w:abstractNum w:abstractNumId="5" w15:restartNumberingAfterBreak="0">
+    <w:multiLevelType w:val="hybridMultilevel"/>
+    <w:lvl w:ilvl="0" w:tentative="1">
+      <w:start w:val="1"/>
+      <w:numFmt w:val="decimal"/>
+      <w:lvlText w:val="%1."/>
+      <w:lvlJc w:val="left"/>
+      <w:pPr>
+        <w:ind w:left="540" w:hanging="360"/>
+      </w:pPr>
+    </w:lvl>
+  </w:abstractNum>
+  <w:abstractNum w:abstractNumId="6" w15:restartNumberingAfterBreak="0">
+    <w:multiLevelType w:val="hybridMultilevel"/>
+    <w:lvl w:ilvl="0" w:tentative="1">
+      <w:start w:val="1"/>
+      <w:numFmt w:val="decimal"/>
+      <w:lvlText w:val="%1."/>
+      <w:lvlJc w:val="left"/>
+      <w:pPr>
+        <w:ind w:left="540" w:hanging="360"/>
+      </w:pPr>
+    </w:lvl>
+  </w:abstractNum>
   <w:num w:numId="1">
     <w:abstractNumId w:val="1"/>
     <w:lvlOverride w:ilvl="0">
@@ -4116,6 +4914,18 @@
   </w:num>
   <w:num w:numId="4">
     <w:abstractNumId w:val="4"/>
+    <w:lvlOverride w:ilvl="0">
+      <w:startOverride w:val="1"/>
+    </w:lvlOverride>
+  </w:num>
+  <w:num w:numId="5">
+    <w:abstractNumId w:val="5"/>
+    <w:lvlOverride w:ilvl="0">
+      <w:startOverride w:val="1"/>
+    </w:lvlOverride>
+  </w:num>
+  <w:num w:numId="6">
+    <w:abstractNumId w:val="6"/>
     <w:lvlOverride w:ilvl="0">
       <w:startOverride w:val="1"/>
     </w:lvlOverride>

</xml_diff>